<commit_message>
trabajo corregido bajo criterios de evalucion posterior
</commit_message>
<xml_diff>
--- a/OLTP y OLAP.docx
+++ b/OLTP y OLAP.docx
@@ -78,8 +78,17 @@
           <w:rFonts w:ascii="Times New Roman" w:eastAsia="Times New Roman" w:hAnsi="Times New Roman" w:cs="Times New Roman"/>
           <w:color w:val="000000" w:themeColor="text1"/>
         </w:rPr>
-        <w:t>Estudiante de SQL Flex CoderHouse</w:t>
-      </w:r>
+        <w:t xml:space="preserve">Estudiante de SQL Flex </w:t>
+      </w:r>
+      <w:proofErr w:type="spellStart"/>
+      <w:r>
+        <w:rPr>
+          <w:rFonts w:ascii="Times New Roman" w:eastAsia="Times New Roman" w:hAnsi="Times New Roman" w:cs="Times New Roman"/>
+          <w:color w:val="000000" w:themeColor="text1"/>
+        </w:rPr>
+        <w:t>CoderHouse</w:t>
+      </w:r>
+      <w:proofErr w:type="spellEnd"/>
     </w:p>
     <w:p>
       <w:pPr>
@@ -172,7 +181,7 @@
     </w:p>
     <w:tbl>
       <w:tblPr>
-        <w:tblW w:w="10783" w:type="dxa"/>
+        <w:tblW w:w="10805" w:type="dxa"/>
         <w:tblInd w:w="-15" w:type="dxa"/>
         <w:tblBorders>
           <w:top w:val="single" w:sz="4" w:space="0" w:color="auto"/>
@@ -189,24 +198,19 @@
         <w:tblLook w:val="0000" w:firstRow="0" w:lastRow="0" w:firstColumn="0" w:lastColumn="0" w:noHBand="0" w:noVBand="0"/>
       </w:tblPr>
       <w:tblGrid>
-        <w:gridCol w:w="2420"/>
-        <w:gridCol w:w="1448"/>
-        <w:gridCol w:w="3315"/>
-        <w:gridCol w:w="3600"/>
+        <w:gridCol w:w="2009"/>
+        <w:gridCol w:w="1430"/>
+        <w:gridCol w:w="2571"/>
+        <w:gridCol w:w="2698"/>
+        <w:gridCol w:w="2097"/>
       </w:tblGrid>
       <w:tr>
-        <w:tblPrEx>
-          <w:tblCellMar>
-            <w:top w:w="0" w:type="dxa"/>
-            <w:bottom w:w="0" w:type="dxa"/>
-          </w:tblCellMar>
-        </w:tblPrEx>
         <w:trPr>
           <w:trHeight w:val="885"/>
         </w:trPr>
         <w:tc>
           <w:tcPr>
-            <w:tcW w:w="2420" w:type="dxa"/>
+            <w:tcW w:w="2009" w:type="dxa"/>
             <w:vAlign w:val="center"/>
           </w:tcPr>
           <w:p>
@@ -228,7 +232,7 @@
         </w:tc>
         <w:tc>
           <w:tcPr>
-            <w:tcW w:w="1448" w:type="dxa"/>
+            <w:tcW w:w="1430" w:type="dxa"/>
             <w:vAlign w:val="center"/>
           </w:tcPr>
           <w:p>
@@ -250,7 +254,7 @@
         </w:tc>
         <w:tc>
           <w:tcPr>
-            <w:tcW w:w="3315" w:type="dxa"/>
+            <w:tcW w:w="2571" w:type="dxa"/>
             <w:vAlign w:val="center"/>
           </w:tcPr>
           <w:p>
@@ -272,7 +276,7 @@
         </w:tc>
         <w:tc>
           <w:tcPr>
-            <w:tcW w:w="3600" w:type="dxa"/>
+            <w:tcW w:w="2698" w:type="dxa"/>
             <w:vAlign w:val="center"/>
           </w:tcPr>
           <w:p>
@@ -292,20 +296,38 @@
             </w:r>
           </w:p>
         </w:tc>
+        <w:tc>
+          <w:tcPr>
+            <w:tcW w:w="2097" w:type="dxa"/>
+            <w:vAlign w:val="center"/>
+          </w:tcPr>
+          <w:p>
+            <w:pPr>
+              <w:jc w:val="center"/>
+              <w:rPr>
+                <w:rFonts w:ascii="Times New Roman" w:eastAsia="Times New Roman" w:hAnsi="Times New Roman" w:cs="Times New Roman"/>
+                <w:color w:val="EE0000"/>
+              </w:rPr>
+            </w:pPr>
+            <w:proofErr w:type="spellStart"/>
+            <w:r>
+              <w:rPr>
+                <w:rFonts w:ascii="Times New Roman" w:eastAsia="Times New Roman" w:hAnsi="Times New Roman" w:cs="Times New Roman"/>
+                <w:color w:val="EE0000"/>
+              </w:rPr>
+              <w:t>optimizacion</w:t>
+            </w:r>
+            <w:proofErr w:type="spellEnd"/>
+          </w:p>
+        </w:tc>
       </w:tr>
       <w:tr>
-        <w:tblPrEx>
-          <w:tblCellMar>
-            <w:top w:w="0" w:type="dxa"/>
-            <w:bottom w:w="0" w:type="dxa"/>
-          </w:tblCellMar>
-        </w:tblPrEx>
         <w:trPr>
           <w:trHeight w:val="703"/>
         </w:trPr>
         <w:tc>
           <w:tcPr>
-            <w:tcW w:w="2420" w:type="dxa"/>
+            <w:tcW w:w="2009" w:type="dxa"/>
             <w:vAlign w:val="center"/>
           </w:tcPr>
           <w:p>
@@ -334,7 +356,7 @@
         </w:tc>
         <w:tc>
           <w:tcPr>
-            <w:tcW w:w="1448" w:type="dxa"/>
+            <w:tcW w:w="1430" w:type="dxa"/>
             <w:vAlign w:val="center"/>
           </w:tcPr>
           <w:p>
@@ -361,7 +383,7 @@
         </w:tc>
         <w:tc>
           <w:tcPr>
-            <w:tcW w:w="3315" w:type="dxa"/>
+            <w:tcW w:w="2571" w:type="dxa"/>
             <w:vAlign w:val="center"/>
           </w:tcPr>
           <w:p>
@@ -391,7 +413,7 @@
         </w:tc>
         <w:tc>
           <w:tcPr>
-            <w:tcW w:w="3600" w:type="dxa"/>
+            <w:tcW w:w="2698" w:type="dxa"/>
           </w:tcPr>
           <w:p>
             <w:pPr>
@@ -406,23 +428,37 @@
                 <w:color w:val="000000" w:themeColor="text1"/>
               </w:rPr>
               <w:t xml:space="preserve">Modelo relacional normalizado (3FN). Arquitectura basada en base de datos transaccional. </w:t>
+            </w:r>
+          </w:p>
+        </w:tc>
+        <w:tc>
+          <w:tcPr>
+            <w:tcW w:w="2097" w:type="dxa"/>
+          </w:tcPr>
+          <w:p>
+            <w:pPr>
+              <w:rPr>
+                <w:rFonts w:ascii="Times New Roman" w:eastAsia="Times New Roman" w:hAnsi="Times New Roman" w:cs="Times New Roman"/>
+                <w:color w:val="000000" w:themeColor="text1"/>
+              </w:rPr>
+            </w:pPr>
+            <w:r>
+              <w:rPr>
+                <w:rFonts w:ascii="Times New Roman" w:eastAsia="Times New Roman" w:hAnsi="Times New Roman" w:cs="Times New Roman"/>
+                <w:color w:val="000000" w:themeColor="text1"/>
+              </w:rPr>
+              <w:t>Índices B-Tree en claves primarias y campos de búsqueda frecuente para acelerar consultas.</w:t>
             </w:r>
           </w:p>
         </w:tc>
       </w:tr>
       <w:tr>
-        <w:tblPrEx>
-          <w:tblCellMar>
-            <w:top w:w="0" w:type="dxa"/>
-            <w:bottom w:w="0" w:type="dxa"/>
-          </w:tblCellMar>
-        </w:tblPrEx>
         <w:trPr>
           <w:trHeight w:val="569"/>
         </w:trPr>
         <w:tc>
           <w:tcPr>
-            <w:tcW w:w="2420" w:type="dxa"/>
+            <w:tcW w:w="2009" w:type="dxa"/>
             <w:vAlign w:val="center"/>
           </w:tcPr>
           <w:p>
@@ -451,7 +487,7 @@
         </w:tc>
         <w:tc>
           <w:tcPr>
-            <w:tcW w:w="1448" w:type="dxa"/>
+            <w:tcW w:w="1430" w:type="dxa"/>
             <w:vAlign w:val="center"/>
           </w:tcPr>
           <w:p>
@@ -476,7 +512,7 @@
         </w:tc>
         <w:tc>
           <w:tcPr>
-            <w:tcW w:w="3315" w:type="dxa"/>
+            <w:tcW w:w="2571" w:type="dxa"/>
             <w:vAlign w:val="center"/>
           </w:tcPr>
           <w:p>
@@ -506,7 +542,7 @@
         </w:tc>
         <w:tc>
           <w:tcPr>
-            <w:tcW w:w="3600" w:type="dxa"/>
+            <w:tcW w:w="2698" w:type="dxa"/>
           </w:tcPr>
           <w:p>
             <w:pPr>
@@ -521,24 +557,55 @@
                 <w:rFonts w:ascii="Times New Roman" w:eastAsia="Times New Roman" w:hAnsi="Times New Roman" w:cs="Times New Roman"/>
                 <w:color w:val="000000" w:themeColor="text1"/>
               </w:rPr>
-              <w:t>Modelo dimensional (Star Schema). Data Warehouse para análisis.</w:t>
+              <w:t xml:space="preserve">Modelo dimensional (Star Schema). Data </w:t>
+            </w:r>
+            <w:proofErr w:type="spellStart"/>
+            <w:r>
+              <w:rPr>
+                <w:rFonts w:ascii="Times New Roman" w:eastAsia="Times New Roman" w:hAnsi="Times New Roman" w:cs="Times New Roman"/>
+                <w:color w:val="000000" w:themeColor="text1"/>
+              </w:rPr>
+              <w:t>Warehouse</w:t>
+            </w:r>
+            <w:proofErr w:type="spellEnd"/>
+            <w:r>
+              <w:rPr>
+                <w:rFonts w:ascii="Times New Roman" w:eastAsia="Times New Roman" w:hAnsi="Times New Roman" w:cs="Times New Roman"/>
+                <w:color w:val="000000" w:themeColor="text1"/>
+              </w:rPr>
+              <w:t xml:space="preserve"> para análisis.</w:t>
+            </w:r>
+          </w:p>
+        </w:tc>
+        <w:tc>
+          <w:tcPr>
+            <w:tcW w:w="2097" w:type="dxa"/>
+          </w:tcPr>
+          <w:p>
+            <w:pPr>
+              <w:spacing w:after="0"/>
+              <w:rPr>
+                <w:rFonts w:ascii="Times New Roman" w:eastAsia="Times New Roman" w:hAnsi="Times New Roman" w:cs="Times New Roman"/>
+                <w:color w:val="000000" w:themeColor="text1"/>
+              </w:rPr>
+            </w:pPr>
+            <w:r>
+              <w:rPr>
+                <w:rFonts w:ascii="Times New Roman" w:eastAsia="Times New Roman" w:hAnsi="Times New Roman" w:cs="Times New Roman"/>
+                <w:color w:val="000000" w:themeColor="text1"/>
+              </w:rPr>
+              <w:t>Índices Bitmap y particionado horizontal por fechas para acelerar análisis de grandes volúmenes de datos.</w:t>
             </w:r>
           </w:p>
         </w:tc>
       </w:tr>
       <w:tr>
-        <w:tblPrEx>
-          <w:tblCellMar>
-            <w:top w:w="0" w:type="dxa"/>
-            <w:bottom w:w="0" w:type="dxa"/>
-          </w:tblCellMar>
-        </w:tblPrEx>
         <w:trPr>
           <w:trHeight w:val="720"/>
         </w:trPr>
         <w:tc>
           <w:tcPr>
-            <w:tcW w:w="2420" w:type="dxa"/>
+            <w:tcW w:w="2009" w:type="dxa"/>
             <w:vAlign w:val="center"/>
           </w:tcPr>
           <w:p>
@@ -567,7 +634,7 @@
         </w:tc>
         <w:tc>
           <w:tcPr>
-            <w:tcW w:w="1448" w:type="dxa"/>
+            <w:tcW w:w="1430" w:type="dxa"/>
           </w:tcPr>
           <w:p>
             <w:pPr>
@@ -601,7 +668,7 @@
         </w:tc>
         <w:tc>
           <w:tcPr>
-            <w:tcW w:w="3315" w:type="dxa"/>
+            <w:tcW w:w="2571" w:type="dxa"/>
             <w:vAlign w:val="center"/>
           </w:tcPr>
           <w:p>
@@ -631,7 +698,7 @@
         </w:tc>
         <w:tc>
           <w:tcPr>
-            <w:tcW w:w="3600" w:type="dxa"/>
+            <w:tcW w:w="2698" w:type="dxa"/>
           </w:tcPr>
           <w:p>
             <w:pPr>
@@ -650,20 +717,35 @@
             </w:r>
           </w:p>
         </w:tc>
+        <w:tc>
+          <w:tcPr>
+            <w:tcW w:w="2097" w:type="dxa"/>
+          </w:tcPr>
+          <w:p>
+            <w:pPr>
+              <w:spacing w:after="0"/>
+              <w:rPr>
+                <w:rFonts w:ascii="Times New Roman" w:eastAsia="Times New Roman" w:hAnsi="Times New Roman" w:cs="Times New Roman"/>
+                <w:color w:val="000000" w:themeColor="text1"/>
+              </w:rPr>
+            </w:pPr>
+            <w:r>
+              <w:rPr>
+                <w:rFonts w:ascii="Times New Roman" w:eastAsia="Times New Roman" w:hAnsi="Times New Roman" w:cs="Times New Roman"/>
+                <w:color w:val="000000" w:themeColor="text1"/>
+              </w:rPr>
+              <w:t>Índices en códigos de producto y particionado cuando el volumen de registros es muy alto.</w:t>
+            </w:r>
+          </w:p>
+        </w:tc>
       </w:tr>
       <w:tr>
-        <w:tblPrEx>
-          <w:tblCellMar>
-            <w:top w:w="0" w:type="dxa"/>
-            <w:bottom w:w="0" w:type="dxa"/>
-          </w:tblCellMar>
-        </w:tblPrEx>
         <w:trPr>
           <w:trHeight w:val="1399"/>
         </w:trPr>
         <w:tc>
           <w:tcPr>
-            <w:tcW w:w="2420" w:type="dxa"/>
+            <w:tcW w:w="2009" w:type="dxa"/>
             <w:vAlign w:val="center"/>
           </w:tcPr>
           <w:p>
@@ -692,7 +774,7 @@
         </w:tc>
         <w:tc>
           <w:tcPr>
-            <w:tcW w:w="1448" w:type="dxa"/>
+            <w:tcW w:w="1430" w:type="dxa"/>
             <w:vAlign w:val="center"/>
           </w:tcPr>
           <w:p>
@@ -717,7 +799,7 @@
         </w:tc>
         <w:tc>
           <w:tcPr>
-            <w:tcW w:w="3315" w:type="dxa"/>
+            <w:tcW w:w="2571" w:type="dxa"/>
           </w:tcPr>
           <w:p>
             <w:pPr>
@@ -746,7 +828,7 @@
         </w:tc>
         <w:tc>
           <w:tcPr>
-            <w:tcW w:w="3600" w:type="dxa"/>
+            <w:tcW w:w="2698" w:type="dxa"/>
           </w:tcPr>
           <w:p>
             <w:pPr>
@@ -761,7 +843,60 @@
                 <w:rFonts w:ascii="Times New Roman" w:eastAsia="Times New Roman" w:hAnsi="Times New Roman" w:cs="Times New Roman"/>
                 <w:color w:val="000000" w:themeColor="text1"/>
               </w:rPr>
-              <w:t>Modelo dimensional (Star Schema o Snowflake). Data Warehouse o Data Mart financiero.</w:t>
+              <w:t xml:space="preserve">Modelo dimensional (Star Schema o </w:t>
+            </w:r>
+            <w:proofErr w:type="spellStart"/>
+            <w:r>
+              <w:rPr>
+                <w:rFonts w:ascii="Times New Roman" w:eastAsia="Times New Roman" w:hAnsi="Times New Roman" w:cs="Times New Roman"/>
+                <w:color w:val="000000" w:themeColor="text1"/>
+              </w:rPr>
+              <w:t>Snowflake</w:t>
+            </w:r>
+            <w:proofErr w:type="spellEnd"/>
+            <w:r>
+              <w:rPr>
+                <w:rFonts w:ascii="Times New Roman" w:eastAsia="Times New Roman" w:hAnsi="Times New Roman" w:cs="Times New Roman"/>
+                <w:color w:val="000000" w:themeColor="text1"/>
+              </w:rPr>
+              <w:t xml:space="preserve">). Data </w:t>
+            </w:r>
+            <w:proofErr w:type="spellStart"/>
+            <w:r>
+              <w:rPr>
+                <w:rFonts w:ascii="Times New Roman" w:eastAsia="Times New Roman" w:hAnsi="Times New Roman" w:cs="Times New Roman"/>
+                <w:color w:val="000000" w:themeColor="text1"/>
+              </w:rPr>
+              <w:t>Warehouse</w:t>
+            </w:r>
+            <w:proofErr w:type="spellEnd"/>
+            <w:r>
+              <w:rPr>
+                <w:rFonts w:ascii="Times New Roman" w:eastAsia="Times New Roman" w:hAnsi="Times New Roman" w:cs="Times New Roman"/>
+                <w:color w:val="000000" w:themeColor="text1"/>
+              </w:rPr>
+              <w:t xml:space="preserve"> o Data Mart financiero.</w:t>
+            </w:r>
+          </w:p>
+        </w:tc>
+        <w:tc>
+          <w:tcPr>
+            <w:tcW w:w="2097" w:type="dxa"/>
+          </w:tcPr>
+          <w:p>
+            <w:pPr>
+              <w:spacing w:after="0"/>
+              <w:rPr>
+                <w:rFonts w:ascii="Times New Roman" w:eastAsia="Times New Roman" w:hAnsi="Times New Roman" w:cs="Times New Roman"/>
+                <w:color w:val="000000" w:themeColor="text1"/>
+              </w:rPr>
+            </w:pPr>
+            <w:r>
+              <w:rPr>
+                <w:rFonts w:ascii="Times New Roman" w:eastAsia="Times New Roman" w:hAnsi="Times New Roman" w:cs="Times New Roman"/>
+                <w:color w:val="000000" w:themeColor="text1"/>
+              </w:rPr>
+              <w:t>Particionado por año y uso de índices analíticos para mejorar el tiempo de respuesta.</w:t>
             </w:r>
           </w:p>
         </w:tc>
@@ -791,6 +926,404 @@
           <w:bCs/>
           <w:color w:val="000000" w:themeColor="text1"/>
         </w:rPr>
+        <w:t>Consideraciones de Arquitectura y Rendimiento</w:t>
+      </w:r>
+    </w:p>
+    <w:p>
+      <w:pPr>
+        <w:rPr>
+          <w:rFonts w:ascii="Times New Roman" w:eastAsia="Times New Roman" w:hAnsi="Times New Roman" w:cs="Times New Roman"/>
+          <w:b/>
+          <w:bCs/>
+          <w:color w:val="000000" w:themeColor="text1"/>
+        </w:rPr>
+      </w:pPr>
+      <w:r>
+        <w:rPr>
+          <w:rFonts w:ascii="Times New Roman" w:eastAsia="Times New Roman" w:hAnsi="Times New Roman" w:cs="Times New Roman"/>
+          <w:b/>
+          <w:bCs/>
+          <w:color w:val="000000" w:themeColor="text1"/>
+        </w:rPr>
+        <w:t>Optimización mediante índices y particionado</w:t>
+      </w:r>
+    </w:p>
+    <w:p>
+      <w:pPr>
+        <w:rPr>
+          <w:rFonts w:ascii="Times New Roman" w:eastAsia="Times New Roman" w:hAnsi="Times New Roman" w:cs="Times New Roman"/>
+          <w:b/>
+          <w:bCs/>
+          <w:color w:val="000000" w:themeColor="text1"/>
+        </w:rPr>
+      </w:pPr>
+      <w:r>
+        <w:rPr>
+          <w:rFonts w:ascii="Times New Roman" w:eastAsia="Times New Roman" w:hAnsi="Times New Roman" w:cs="Times New Roman"/>
+          <w:b/>
+          <w:bCs/>
+          <w:color w:val="000000" w:themeColor="text1"/>
+        </w:rPr>
+        <w:t>En los sistemas OLTP y OLAP es importante optimizar el acceso a los datos para garantizar un buen rendimiento.</w:t>
+      </w:r>
+    </w:p>
+    <w:p>
+      <w:pPr>
+        <w:rPr>
+          <w:rFonts w:ascii="Times New Roman" w:eastAsia="Times New Roman" w:hAnsi="Times New Roman" w:cs="Times New Roman"/>
+          <w:b/>
+          <w:bCs/>
+          <w:color w:val="000000" w:themeColor="text1"/>
+        </w:rPr>
+      </w:pPr>
+      <w:r>
+        <w:rPr>
+          <w:rFonts w:ascii="Times New Roman" w:eastAsia="Times New Roman" w:hAnsi="Times New Roman" w:cs="Times New Roman"/>
+          <w:b/>
+          <w:bCs/>
+          <w:color w:val="000000" w:themeColor="text1"/>
+        </w:rPr>
+        <w:t>Los índices permiten localizar información de manera más eficiente. Los índices tipo B-Tree son ampliamente utilizados en sistemas OLTP debido a que facilitan búsquedas rápidas sobre claves primarias y columnas frecuentemente consultadas. Por otra parte, los índices Bitmap suelen emplearse en sistemas OLAP para acelerar consultas analíticas sobre grandes volúmenes de datos.</w:t>
+      </w:r>
+    </w:p>
+    <w:p>
+      <w:pPr>
+        <w:rPr>
+          <w:rFonts w:ascii="Times New Roman" w:eastAsia="Times New Roman" w:hAnsi="Times New Roman" w:cs="Times New Roman"/>
+          <w:b/>
+          <w:bCs/>
+          <w:color w:val="000000" w:themeColor="text1"/>
+        </w:rPr>
+      </w:pPr>
+      <w:r>
+        <w:rPr>
+          <w:rFonts w:ascii="Times New Roman" w:eastAsia="Times New Roman" w:hAnsi="Times New Roman" w:cs="Times New Roman"/>
+          <w:b/>
+          <w:bCs/>
+          <w:color w:val="000000" w:themeColor="text1"/>
+        </w:rPr>
+        <w:t>El particionado consiste en dividir grandes tablas en segmentos más pequeños. El particionado horizontal distribuye las filas según criterios como fechas o regiones, mientras que el particionado vertical separa columnas según su frecuencia de uso. Estas técnicas mejoran los tiempos de consulta y facilitan la administración de los datos.</w:t>
+      </w:r>
+    </w:p>
+    <w:p>
+      <w:pPr>
+        <w:rPr>
+          <w:rFonts w:ascii="Times New Roman" w:eastAsia="Times New Roman" w:hAnsi="Times New Roman" w:cs="Times New Roman"/>
+          <w:b/>
+          <w:bCs/>
+          <w:color w:val="000000" w:themeColor="text1"/>
+        </w:rPr>
+      </w:pPr>
+      <w:r>
+        <w:rPr>
+          <w:rFonts w:ascii="Times New Roman" w:eastAsia="Times New Roman" w:hAnsi="Times New Roman" w:cs="Times New Roman"/>
+          <w:b/>
+          <w:bCs/>
+          <w:color w:val="000000" w:themeColor="text1"/>
+        </w:rPr>
+        <w:t xml:space="preserve">Capas de un Data </w:t>
+      </w:r>
+      <w:proofErr w:type="spellStart"/>
+      <w:r>
+        <w:rPr>
+          <w:rFonts w:ascii="Times New Roman" w:eastAsia="Times New Roman" w:hAnsi="Times New Roman" w:cs="Times New Roman"/>
+          <w:b/>
+          <w:bCs/>
+          <w:color w:val="000000" w:themeColor="text1"/>
+        </w:rPr>
+        <w:t>Warehouse</w:t>
+      </w:r>
+      <w:proofErr w:type="spellEnd"/>
+    </w:p>
+    <w:p>
+      <w:pPr>
+        <w:rPr>
+          <w:rFonts w:ascii="Times New Roman" w:eastAsia="Times New Roman" w:hAnsi="Times New Roman" w:cs="Times New Roman"/>
+          <w:b/>
+          <w:bCs/>
+          <w:color w:val="000000" w:themeColor="text1"/>
+        </w:rPr>
+      </w:pPr>
+      <w:r>
+        <w:rPr>
+          <w:rFonts w:ascii="Times New Roman" w:eastAsia="Times New Roman" w:hAnsi="Times New Roman" w:cs="Times New Roman"/>
+          <w:b/>
+          <w:bCs/>
+          <w:color w:val="000000" w:themeColor="text1"/>
+        </w:rPr>
+        <w:t xml:space="preserve">Un Data </w:t>
+      </w:r>
+      <w:proofErr w:type="spellStart"/>
+      <w:r>
+        <w:rPr>
+          <w:rFonts w:ascii="Times New Roman" w:eastAsia="Times New Roman" w:hAnsi="Times New Roman" w:cs="Times New Roman"/>
+          <w:b/>
+          <w:bCs/>
+          <w:color w:val="000000" w:themeColor="text1"/>
+        </w:rPr>
+        <w:t>Warehouse</w:t>
+      </w:r>
+      <w:proofErr w:type="spellEnd"/>
+      <w:r>
+        <w:rPr>
+          <w:rFonts w:ascii="Times New Roman" w:eastAsia="Times New Roman" w:hAnsi="Times New Roman" w:cs="Times New Roman"/>
+          <w:b/>
+          <w:bCs/>
+          <w:color w:val="000000" w:themeColor="text1"/>
+        </w:rPr>
+        <w:t xml:space="preserve"> suele estar compuesto por varias capas:</w:t>
+      </w:r>
+    </w:p>
+    <w:p>
+      <w:pPr>
+        <w:numPr>
+          <w:ilvl w:val="0"/>
+          <w:numId w:val="3"/>
+        </w:numPr>
+        <w:rPr>
+          <w:rFonts w:ascii="Times New Roman" w:eastAsia="Times New Roman" w:hAnsi="Times New Roman" w:cs="Times New Roman"/>
+          <w:b/>
+          <w:bCs/>
+          <w:color w:val="000000" w:themeColor="text1"/>
+        </w:rPr>
+      </w:pPr>
+      <w:r>
+        <w:rPr>
+          <w:rFonts w:ascii="Times New Roman" w:eastAsia="Times New Roman" w:hAnsi="Times New Roman" w:cs="Times New Roman"/>
+          <w:b/>
+          <w:bCs/>
+          <w:color w:val="000000" w:themeColor="text1"/>
+        </w:rPr>
+        <w:t>Ingesta de datos: extracción de información desde sistemas operacionales, archivos y aplicaciones.</w:t>
+      </w:r>
+    </w:p>
+    <w:p>
+      <w:pPr>
+        <w:numPr>
+          <w:ilvl w:val="0"/>
+          <w:numId w:val="3"/>
+        </w:numPr>
+        <w:rPr>
+          <w:rFonts w:ascii="Times New Roman" w:eastAsia="Times New Roman" w:hAnsi="Times New Roman" w:cs="Times New Roman"/>
+          <w:b/>
+          <w:bCs/>
+          <w:color w:val="000000" w:themeColor="text1"/>
+        </w:rPr>
+      </w:pPr>
+      <w:proofErr w:type="spellStart"/>
+      <w:r>
+        <w:rPr>
+          <w:rFonts w:ascii="Times New Roman" w:eastAsia="Times New Roman" w:hAnsi="Times New Roman" w:cs="Times New Roman"/>
+          <w:b/>
+          <w:bCs/>
+          <w:color w:val="000000" w:themeColor="text1"/>
+        </w:rPr>
+        <w:t>Staging</w:t>
+      </w:r>
+      <w:proofErr w:type="spellEnd"/>
+      <w:r>
+        <w:rPr>
+          <w:rFonts w:ascii="Times New Roman" w:eastAsia="Times New Roman" w:hAnsi="Times New Roman" w:cs="Times New Roman"/>
+          <w:b/>
+          <w:bCs/>
+          <w:color w:val="000000" w:themeColor="text1"/>
+        </w:rPr>
+        <w:t xml:space="preserve"> Area: almacenamiento temporal donde los datos son limpiados y transformados.</w:t>
+      </w:r>
+    </w:p>
+    <w:p>
+      <w:pPr>
+        <w:numPr>
+          <w:ilvl w:val="0"/>
+          <w:numId w:val="3"/>
+        </w:numPr>
+        <w:rPr>
+          <w:rFonts w:ascii="Times New Roman" w:eastAsia="Times New Roman" w:hAnsi="Times New Roman" w:cs="Times New Roman"/>
+          <w:b/>
+          <w:bCs/>
+          <w:color w:val="000000" w:themeColor="text1"/>
+        </w:rPr>
+      </w:pPr>
+      <w:r>
+        <w:rPr>
+          <w:rFonts w:ascii="Times New Roman" w:eastAsia="Times New Roman" w:hAnsi="Times New Roman" w:cs="Times New Roman"/>
+          <w:b/>
+          <w:bCs/>
+          <w:color w:val="000000" w:themeColor="text1"/>
+        </w:rPr>
+        <w:t xml:space="preserve">Storage (Data </w:t>
+      </w:r>
+      <w:proofErr w:type="spellStart"/>
+      <w:r>
+        <w:rPr>
+          <w:rFonts w:ascii="Times New Roman" w:eastAsia="Times New Roman" w:hAnsi="Times New Roman" w:cs="Times New Roman"/>
+          <w:b/>
+          <w:bCs/>
+          <w:color w:val="000000" w:themeColor="text1"/>
+        </w:rPr>
+        <w:t>Warehouse</w:t>
+      </w:r>
+      <w:proofErr w:type="spellEnd"/>
+      <w:r>
+        <w:rPr>
+          <w:rFonts w:ascii="Times New Roman" w:eastAsia="Times New Roman" w:hAnsi="Times New Roman" w:cs="Times New Roman"/>
+          <w:b/>
+          <w:bCs/>
+          <w:color w:val="000000" w:themeColor="text1"/>
+        </w:rPr>
+        <w:t>): repositorio central donde se almacenan los datos integrados e históricos.</w:t>
+      </w:r>
+    </w:p>
+    <w:p>
+      <w:pPr>
+        <w:numPr>
+          <w:ilvl w:val="0"/>
+          <w:numId w:val="3"/>
+        </w:numPr>
+        <w:rPr>
+          <w:rFonts w:ascii="Times New Roman" w:eastAsia="Times New Roman" w:hAnsi="Times New Roman" w:cs="Times New Roman"/>
+          <w:b/>
+          <w:bCs/>
+          <w:color w:val="000000" w:themeColor="text1"/>
+        </w:rPr>
+      </w:pPr>
+      <w:r>
+        <w:rPr>
+          <w:rFonts w:ascii="Times New Roman" w:eastAsia="Times New Roman" w:hAnsi="Times New Roman" w:cs="Times New Roman"/>
+          <w:b/>
+          <w:bCs/>
+          <w:color w:val="000000" w:themeColor="text1"/>
+        </w:rPr>
+        <w:t>Data Marts: subconjuntos especializados orientados a áreas específicas del negocio.</w:t>
+      </w:r>
+    </w:p>
+    <w:p>
+      <w:pPr>
+        <w:numPr>
+          <w:ilvl w:val="0"/>
+          <w:numId w:val="3"/>
+        </w:numPr>
+        <w:rPr>
+          <w:rFonts w:ascii="Times New Roman" w:eastAsia="Times New Roman" w:hAnsi="Times New Roman" w:cs="Times New Roman"/>
+          <w:b/>
+          <w:bCs/>
+          <w:color w:val="000000" w:themeColor="text1"/>
+        </w:rPr>
+      </w:pPr>
+      <w:r>
+        <w:rPr>
+          <w:rFonts w:ascii="Times New Roman" w:eastAsia="Times New Roman" w:hAnsi="Times New Roman" w:cs="Times New Roman"/>
+          <w:b/>
+          <w:bCs/>
+          <w:color w:val="000000" w:themeColor="text1"/>
+        </w:rPr>
+        <w:t>Herramientas BI: plataformas utilizadas para generar reportes, análisis y tableros de control.</w:t>
+      </w:r>
+    </w:p>
+    <w:p>
+      <w:pPr>
+        <w:rPr>
+          <w:rFonts w:ascii="Times New Roman" w:eastAsia="Times New Roman" w:hAnsi="Times New Roman" w:cs="Times New Roman"/>
+          <w:b/>
+          <w:bCs/>
+          <w:color w:val="000000" w:themeColor="text1"/>
+        </w:rPr>
+      </w:pPr>
+      <w:r>
+        <w:rPr>
+          <w:rFonts w:ascii="Times New Roman" w:eastAsia="Times New Roman" w:hAnsi="Times New Roman" w:cs="Times New Roman"/>
+          <w:b/>
+          <w:bCs/>
+          <w:color w:val="000000" w:themeColor="text1"/>
+        </w:rPr>
+        <w:t>Flujo de datos</w:t>
+      </w:r>
+    </w:p>
+    <w:p>
+      <w:pPr>
+        <w:rPr>
+          <w:rFonts w:ascii="Times New Roman" w:eastAsia="Times New Roman" w:hAnsi="Times New Roman" w:cs="Times New Roman"/>
+          <w:b/>
+          <w:bCs/>
+          <w:color w:val="000000" w:themeColor="text1"/>
+        </w:rPr>
+      </w:pPr>
+      <w:r>
+        <w:rPr>
+          <w:rFonts w:ascii="Times New Roman" w:eastAsia="Times New Roman" w:hAnsi="Times New Roman" w:cs="Times New Roman"/>
+          <w:b/>
+          <w:bCs/>
+          <w:color w:val="000000" w:themeColor="text1"/>
+        </w:rPr>
+        <w:t xml:space="preserve">Fuentes de datos → Ingesta → </w:t>
+      </w:r>
+      <w:proofErr w:type="spellStart"/>
+      <w:r>
+        <w:rPr>
+          <w:rFonts w:ascii="Times New Roman" w:eastAsia="Times New Roman" w:hAnsi="Times New Roman" w:cs="Times New Roman"/>
+          <w:b/>
+          <w:bCs/>
+          <w:color w:val="000000" w:themeColor="text1"/>
+        </w:rPr>
+        <w:t>Staging</w:t>
+      </w:r>
+      <w:proofErr w:type="spellEnd"/>
+      <w:r>
+        <w:rPr>
+          <w:rFonts w:ascii="Times New Roman" w:eastAsia="Times New Roman" w:hAnsi="Times New Roman" w:cs="Times New Roman"/>
+          <w:b/>
+          <w:bCs/>
+          <w:color w:val="000000" w:themeColor="text1"/>
+        </w:rPr>
+        <w:t xml:space="preserve"> → Data </w:t>
+      </w:r>
+      <w:proofErr w:type="spellStart"/>
+      <w:r>
+        <w:rPr>
+          <w:rFonts w:ascii="Times New Roman" w:eastAsia="Times New Roman" w:hAnsi="Times New Roman" w:cs="Times New Roman"/>
+          <w:b/>
+          <w:bCs/>
+          <w:color w:val="000000" w:themeColor="text1"/>
+        </w:rPr>
+        <w:t>Warehouse</w:t>
+      </w:r>
+      <w:proofErr w:type="spellEnd"/>
+      <w:r>
+        <w:rPr>
+          <w:rFonts w:ascii="Times New Roman" w:eastAsia="Times New Roman" w:hAnsi="Times New Roman" w:cs="Times New Roman"/>
+          <w:b/>
+          <w:bCs/>
+          <w:color w:val="000000" w:themeColor="text1"/>
+        </w:rPr>
+        <w:t xml:space="preserve"> → Data Marts → Herramientas BI</w:t>
+      </w:r>
+    </w:p>
+    <w:p>
+      <w:pPr>
+        <w:rPr>
+          <w:rFonts w:ascii="Times New Roman" w:eastAsia="Times New Roman" w:hAnsi="Times New Roman" w:cs="Times New Roman"/>
+          <w:b/>
+          <w:bCs/>
+          <w:color w:val="000000" w:themeColor="text1"/>
+        </w:rPr>
+      </w:pPr>
+    </w:p>
+    <w:p>
+      <w:pPr>
+        <w:rPr>
+          <w:rFonts w:ascii="Times New Roman" w:eastAsia="Times New Roman" w:hAnsi="Times New Roman" w:cs="Times New Roman"/>
+          <w:b/>
+          <w:bCs/>
+          <w:color w:val="000000" w:themeColor="text1"/>
+        </w:rPr>
+      </w:pPr>
+      <w:r>
+        <w:rPr>
+          <w:rFonts w:ascii="Times New Roman" w:eastAsia="Times New Roman" w:hAnsi="Times New Roman" w:cs="Times New Roman"/>
+          <w:b/>
+          <w:bCs/>
+          <w:color w:val="000000" w:themeColor="text1"/>
+        </w:rPr>
         <w:t>Importancia de separar sistemas OLTP y OLAP</w:t>
       </w:r>
     </w:p>
@@ -890,6 +1423,7 @@
           <w:rFonts w:ascii="Times New Roman" w:eastAsia="Times New Roman" w:hAnsi="Times New Roman" w:cs="Times New Roman"/>
           <w:color w:val="000000" w:themeColor="text1"/>
         </w:rPr>
+        <w:lastRenderedPageBreak/>
         <w:t xml:space="preserve">Crear pedidos. </w:t>
       </w:r>
     </w:p>
@@ -1004,6 +1538,14 @@
         </w:rPr>
         <w:t>Consultas complejas sobre datos históricos.</w:t>
       </w:r>
+    </w:p>
+    <w:p>
+      <w:pPr>
+        <w:rPr>
+          <w:rFonts w:ascii="Times New Roman" w:eastAsia="Times New Roman" w:hAnsi="Times New Roman" w:cs="Times New Roman"/>
+          <w:color w:val="000000" w:themeColor="text1"/>
+        </w:rPr>
+      </w:pPr>
     </w:p>
     <w:p>
       <w:pPr>
@@ -1332,11 +1874,127 @@
       </w:rPr>
     </w:lvl>
   </w:abstractNum>
+  <w:abstractNum w:abstractNumId="2" w15:restartNumberingAfterBreak="0">
+    <w:nsid w:val="6AB90B0F"/>
+    <w:multiLevelType w:val="multilevel"/>
+    <w:tmpl w:val="FE3624E0"/>
+    <w:lvl w:ilvl="0">
+      <w:start w:val="1"/>
+      <w:numFmt w:val="decimal"/>
+      <w:lvlText w:val="%1."/>
+      <w:lvlJc w:val="left"/>
+      <w:pPr>
+        <w:tabs>
+          <w:tab w:val="num" w:pos="720"/>
+        </w:tabs>
+        <w:ind w:left="720" w:hanging="360"/>
+      </w:pPr>
+    </w:lvl>
+    <w:lvl w:ilvl="1" w:tentative="1">
+      <w:start w:val="1"/>
+      <w:numFmt w:val="decimal"/>
+      <w:lvlText w:val="%2."/>
+      <w:lvlJc w:val="left"/>
+      <w:pPr>
+        <w:tabs>
+          <w:tab w:val="num" w:pos="1440"/>
+        </w:tabs>
+        <w:ind w:left="1440" w:hanging="360"/>
+      </w:pPr>
+    </w:lvl>
+    <w:lvl w:ilvl="2" w:tentative="1">
+      <w:start w:val="1"/>
+      <w:numFmt w:val="decimal"/>
+      <w:lvlText w:val="%3."/>
+      <w:lvlJc w:val="left"/>
+      <w:pPr>
+        <w:tabs>
+          <w:tab w:val="num" w:pos="2160"/>
+        </w:tabs>
+        <w:ind w:left="2160" w:hanging="360"/>
+      </w:pPr>
+    </w:lvl>
+    <w:lvl w:ilvl="3" w:tentative="1">
+      <w:start w:val="1"/>
+      <w:numFmt w:val="decimal"/>
+      <w:lvlText w:val="%4."/>
+      <w:lvlJc w:val="left"/>
+      <w:pPr>
+        <w:tabs>
+          <w:tab w:val="num" w:pos="2880"/>
+        </w:tabs>
+        <w:ind w:left="2880" w:hanging="360"/>
+      </w:pPr>
+    </w:lvl>
+    <w:lvl w:ilvl="4" w:tentative="1">
+      <w:start w:val="1"/>
+      <w:numFmt w:val="decimal"/>
+      <w:lvlText w:val="%5."/>
+      <w:lvlJc w:val="left"/>
+      <w:pPr>
+        <w:tabs>
+          <w:tab w:val="num" w:pos="3600"/>
+        </w:tabs>
+        <w:ind w:left="3600" w:hanging="360"/>
+      </w:pPr>
+    </w:lvl>
+    <w:lvl w:ilvl="5" w:tentative="1">
+      <w:start w:val="1"/>
+      <w:numFmt w:val="decimal"/>
+      <w:lvlText w:val="%6."/>
+      <w:lvlJc w:val="left"/>
+      <w:pPr>
+        <w:tabs>
+          <w:tab w:val="num" w:pos="4320"/>
+        </w:tabs>
+        <w:ind w:left="4320" w:hanging="360"/>
+      </w:pPr>
+    </w:lvl>
+    <w:lvl w:ilvl="6" w:tentative="1">
+      <w:start w:val="1"/>
+      <w:numFmt w:val="decimal"/>
+      <w:lvlText w:val="%7."/>
+      <w:lvlJc w:val="left"/>
+      <w:pPr>
+        <w:tabs>
+          <w:tab w:val="num" w:pos="5040"/>
+        </w:tabs>
+        <w:ind w:left="5040" w:hanging="360"/>
+      </w:pPr>
+    </w:lvl>
+    <w:lvl w:ilvl="7" w:tentative="1">
+      <w:start w:val="1"/>
+      <w:numFmt w:val="decimal"/>
+      <w:lvlText w:val="%8."/>
+      <w:lvlJc w:val="left"/>
+      <w:pPr>
+        <w:tabs>
+          <w:tab w:val="num" w:pos="5760"/>
+        </w:tabs>
+        <w:ind w:left="5760" w:hanging="360"/>
+      </w:pPr>
+    </w:lvl>
+    <w:lvl w:ilvl="8" w:tentative="1">
+      <w:start w:val="1"/>
+      <w:numFmt w:val="decimal"/>
+      <w:lvlText w:val="%9."/>
+      <w:lvlJc w:val="left"/>
+      <w:pPr>
+        <w:tabs>
+          <w:tab w:val="num" w:pos="6480"/>
+        </w:tabs>
+        <w:ind w:left="6480" w:hanging="360"/>
+      </w:pPr>
+    </w:lvl>
+  </w:abstractNum>
   <w:num w:numId="1" w16cid:durableId="1558130802">
     <w:abstractNumId w:val="1"/>
   </w:num>
   <w:num w:numId="2" w16cid:durableId="2062167008">
     <w:abstractNumId w:val="0"/>
+  </w:num>
+  <w:num w:numId="3" w16cid:durableId="379328433">
+    <w:abstractNumId w:val="2"/>
   </w:num>
 </w:numbering>
 </file>

</xml_diff>